<commit_message>
Narrative pass: Royal Selection story in the GDD, renamed characters and Abilities, narrative palette and lettering on the cards, Briar Knight retuned
Co-Authored-By: Claude Opus 5.5 <noreply@anthropic.com>
</commit_message>
<xml_diff>
--- a/Kingbound-GDD.docx
+++ b/Kingbound-GDD.docx
@@ -218,7 +218,28 @@
           <w:color w:val="222222"/>
           <w:sz w:val="21"/>
         </w:rPr>
-        <w:t>The king needs one new soldier. Four recruits roam the realm, fight monsters, train and gear up. The first to reach level 10 is chosen. The last level only comes from beating the King's Champion at the Castle, and while you fight it, the other three try to stop you.</w:t>
+        <w:t>In the Kingdom of Names, the deeds of great soldiers are written into the Royal Chronicle. Every Royal Selection brings four candidates together for one place in the royal army. They roam the Unwritten Lands, fight monsters, train and gear up, each with a private ambition of their own. The first to reach level 10 earns the place and a name worthy of the Chronicle. The last level only comes from beating the King's Champion at the Castle, and while you fight it, the other three try to stop you.</w:t>
+      </w:r>
+    </w:p>
+    <w:p>
+      <w:pPr>
+        <w:pStyle w:val="Heading2"/>
+      </w:pPr>
+      <w:r>
+        <w:t>The world</w:t>
+      </w:r>
+    </w:p>
+    <w:p>
+      <w:pPr>
+        <w:spacing w:before="0" w:after="100" w:lineRule="auto" w:line="276"/>
+      </w:pPr>
+      <w:r>
+        <w:rPr>
+          <w:rFonts w:ascii="Calibri" w:hAnsi="Calibri" w:cs="Calibri" w:eastAsia="Calibri"/>
+          <w:color w:val="222222"/>
+          <w:sz w:val="21"/>
+        </w:rPr>
+        <w:t>To be Kingbound is to be bound to the crown by ambition, duty or the wish to be remembered. The kingdom is older than the competition: beyond its settlements lie ruins, forgotten roads and creatures known only from old accounts. The mood is adventurous fantasy, not dark fantasy: danger is real, but the world invites exploring, and a rival can be an obstacle, a temporary ally or an unexpected helper. The look is an old illustrated chronicle: medieval woodcuts, illuminated manuscripts, folklore pictures and antique maps, in oxide red, deep forest green, ink black, aged parchment, antique gold and muted cobalt.</w:t>
       </w:r>
     </w:p>
     <w:p>
@@ -2271,7 +2292,7 @@
         </w:rPr>
         <w:t>4.</w:t>
         <w:tab/>
-        <w:t>Shuffle the Action deck. Each player draws up to their hand size (5, Ranger 6).</w:t>
+        <w:t>Shuffle the Action deck. Each player draws up to their hand size (5, Hollow Pilgrim 6).</w:t>
       </w:r>
     </w:p>
     <w:p>
@@ -3063,7 +3084,7 @@
                 <w:color w:val="222222"/>
                 <w:sz w:val="20"/>
               </w:rPr>
-              <w:t>Your Action cards. A card you play is gone until you REST, so the same hand has to last through several fights. Hand size (5, Ranger 6) is how many cards you draw up to when you REST; some effects let you hold more.</w:t>
+              <w:t>Your Action cards. A card you play is gone until you REST, so the same hand has to last through several fights. Hand size (5, Hollow Pilgrim 6) is how many cards you draw up to when you REST; some effects let you hold more.</w:t>
             </w:r>
           </w:p>
         </w:tc>
@@ -3104,7 +3125,7 @@
                 <w:color w:val="222222"/>
                 <w:sz w:val="20"/>
               </w:rPr>
-              <w:t>3 each round (Rogue 4). Each card costs 0, 1 or 2 energy. Energy you don't spend is lost at the end of the round.</w:t>
+              <w:t>3 each round (Foxglove 4). Each card costs 0, 1 or 2 energy. Energy you don't spend is lost at the end of the round.</w:t>
             </w:r>
           </w:p>
         </w:tc>
@@ -4079,7 +4100,7 @@
           <w:color w:val="222222"/>
           <w:sz w:val="21"/>
         </w:rPr>
-        <w:t>The AGI card Vanish and the Smoke Bomb item let you escape without rolling. Snare (Ranger) stops every kind of fleeing.</w:t>
+        <w:t>The AGI card Vanish and the Smoke Bomb item let you escape without rolling. Lantern Veil (Hollow Pilgrim) stops every kind of fleeing.</w:t>
       </w:r>
     </w:p>
     <w:p>
@@ -4386,7 +4407,7 @@
           <w:color w:val="222222"/>
           <w:sz w:val="21"/>
         </w:rPr>
-        <w:t>Mira plays the Knight: STR 3, AGI 0, WIS 1, HP 13, 3 energy. Mira is level 4, carries an Iron Sword (+1 damage on STR cards) and holds Strike, Heavy Blow, Brace, Spark and Dodge. Mira stops on a Wilds II tile and draws an Orc Raider (HP 13, ATK 4, 3 gold).</w:t>
+        <w:t>Mira plays the Bellkeeper: STR 3, AGI 0, WIS 1, HP 13, 3 energy. Mira is level 4, carries an Iron Sword (+1 damage on STR cards) and holds Strike, Heavy Blow, Brace, Spark and Dodge. Mira stops on a Wilds II tile and draws an Orc Raider (HP 13, ATK 4, 3 gold).</w:t>
       </w:r>
     </w:p>
     <w:p>
@@ -4408,7 +4429,7 @@
           <w:color w:val="222222"/>
           <w:sz w:val="21"/>
         </w:rPr>
-        <w:t xml:space="preserve"> Ben (Rogue) offers Backstab for 2 gold. Mira expects 15 damage to be enough and says no.</w:t>
+        <w:t xml:space="preserve"> Ben (Foxglove) offers Quickstep for 2 gold. Mira expects 15 damage to be enough and says no.</w:t>
       </w:r>
     </w:p>
     <w:p>
@@ -4450,7 +4471,7 @@
           <w:color w:val="222222"/>
           <w:sz w:val="21"/>
         </w:rPr>
-        <w:t>Interference: Ben passes. Lea (Mage) uses Hex and removes 4 damage, so the damage is 11.</w:t>
+        <w:t>Interference: Ben passes. Lea (Ash Scribe) uses Ink Snare and removes 4 damage, so the damage is 11.</w:t>
       </w:r>
     </w:p>
     <w:p>
@@ -4533,7 +4554,7 @@
           <w:color w:val="222222"/>
           <w:sz w:val="21"/>
         </w:rPr>
-        <w:t>Lea's Hex stays face down until Lea rests. Mira has two cards left and neither deals damage, so Mira will probably REST next turn.</w:t>
+        <w:t>Lea's Ink Snare stays face down until Lea rests. Mira has two cards left and neither deals damage, so Mira will probably REST next turn.</w:t>
       </w:r>
     </w:p>
     <w:p>
@@ -6441,7 +6462,7 @@
                 <w:color w:val="222222"/>
                 <w:sz w:val="19"/>
               </w:rPr>
-              <w:t>Flee now, no roll. Not while Snared.</w:t>
+              <w:t>Flee now, no roll. Not while veiled.</w:t>
             </w:r>
           </w:p>
         </w:tc>
@@ -12099,7 +12120,7 @@
                 <w:color w:val="222222"/>
                 <w:sz w:val="20"/>
               </w:rPr>
-              <w:t>In your fight: flee, no roll. Not while Snared.</w:t>
+              <w:t>In your fight: flee, no roll. Not while veiled.</w:t>
             </w:r>
           </w:p>
         </w:tc>
@@ -12331,14 +12352,14 @@
         </w:tblCellMar>
       </w:tblPr>
       <w:tblGrid>
-        <w:gridCol w:w="1225"/>
+        <w:gridCol w:w="1763"/>
         <w:gridCol w:w="578"/>
         <w:gridCol w:w="578"/>
         <w:gridCol w:w="578"/>
         <w:gridCol w:w="471"/>
         <w:gridCol w:w="901"/>
         <w:gridCol w:w="686"/>
-        <w:gridCol w:w="4620"/>
+        <w:gridCol w:w="4082"/>
       </w:tblGrid>
       <w:tr>
         <w:trPr>
@@ -12347,7 +12368,7 @@
         </w:trPr>
         <w:tc>
           <w:tcPr>
-            <w:tcW w:type="dxa" w:w="1225"/>
+            <w:tcW w:type="dxa" w:w="1763"/>
             <w:shd w:val="clear" w:color="auto" w:fill="EDEDED"/>
           </w:tcPr>
           <w:p>
@@ -12487,7 +12508,7 @@
         </w:tc>
         <w:tc>
           <w:tcPr>
-            <w:tcW w:type="dxa" w:w="4620"/>
+            <w:tcW w:type="dxa" w:w="4082"/>
             <w:shd w:val="clear" w:color="auto" w:fill="EDEDED"/>
           </w:tcPr>
           <w:p>
@@ -12512,7 +12533,7 @@
         </w:trPr>
         <w:tc>
           <w:tcPr>
-            <w:tcW w:type="dxa" w:w="1225"/>
+            <w:tcW w:type="dxa" w:w="1763"/>
           </w:tcPr>
           <w:p>
             <w:pPr>
@@ -12524,7 +12545,7 @@
                 <w:color w:val="222222"/>
                 <w:sz w:val="19"/>
               </w:rPr>
-              <w:t>Knight</w:t>
+              <w:t>Bellkeeper</w:t>
             </w:r>
           </w:p>
         </w:tc>
@@ -12638,7 +12659,7 @@
         </w:tc>
         <w:tc>
           <w:tcPr>
-            <w:tcW w:type="dxa" w:w="4620"/>
+            <w:tcW w:type="dxa" w:w="4082"/>
           </w:tcPr>
           <w:p>
             <w:pPr>
@@ -12650,7 +12671,7 @@
                 <w:color w:val="222222"/>
                 <w:sz w:val="19"/>
               </w:rPr>
-              <w:t>Steady hitter; a good helper to hire</w:t>
+              <w:t>Defensive warrior; a good helper to hire</w:t>
             </w:r>
           </w:p>
         </w:tc>
@@ -12661,7 +12682,7 @@
         </w:trPr>
         <w:tc>
           <w:tcPr>
-            <w:tcW w:type="dxa" w:w="1225"/>
+            <w:tcW w:type="dxa" w:w="1763"/>
           </w:tcPr>
           <w:p>
             <w:pPr>
@@ -12673,7 +12694,7 @@
                 <w:color w:val="222222"/>
                 <w:sz w:val="19"/>
               </w:rPr>
-              <w:t>Rogue</w:t>
+              <w:t>Foxglove</w:t>
             </w:r>
           </w:p>
         </w:tc>
@@ -12787,7 +12808,7 @@
         </w:tc>
         <w:tc>
           <w:tcPr>
-            <w:tcW w:type="dxa" w:w="4620"/>
+            <w:tcW w:type="dxa" w:w="4082"/>
           </w:tcPr>
           <w:p>
             <w:pPr>
@@ -12799,7 +12820,7 @@
                 <w:color w:val="222222"/>
                 <w:sz w:val="19"/>
               </w:rPr>
-              <w:t>Fast, uses up cards quickly, steals gold</w:t>
+              <w:t>Agile trickster: fast, uses up cards quickly, steals gold</w:t>
             </w:r>
           </w:p>
         </w:tc>
@@ -12810,7 +12831,7 @@
         </w:trPr>
         <w:tc>
           <w:tcPr>
-            <w:tcW w:type="dxa" w:w="1225"/>
+            <w:tcW w:type="dxa" w:w="1763"/>
           </w:tcPr>
           <w:p>
             <w:pPr>
@@ -12822,7 +12843,7 @@
                 <w:color w:val="222222"/>
                 <w:sz w:val="19"/>
               </w:rPr>
-              <w:t>Mage</w:t>
+              <w:t>Ash Scribe</w:t>
             </w:r>
           </w:p>
         </w:tc>
@@ -12936,7 +12957,7 @@
         </w:tc>
         <w:tc>
           <w:tcPr>
-            <w:tcW w:type="dxa" w:w="4620"/>
+            <w:tcW w:type="dxa" w:w="4082"/>
           </w:tcPr>
           <w:p>
             <w:pPr>
@@ -12948,7 +12969,7 @@
                 <w:color w:val="222222"/>
                 <w:sz w:val="19"/>
               </w:rPr>
-              <w:t>Big damage, fragile</w:t>
+              <w:t>Scholar: big damage, fragile</w:t>
             </w:r>
           </w:p>
         </w:tc>
@@ -12959,7 +12980,7 @@
         </w:trPr>
         <w:tc>
           <w:tcPr>
-            <w:tcW w:type="dxa" w:w="1225"/>
+            <w:tcW w:type="dxa" w:w="1763"/>
           </w:tcPr>
           <w:p>
             <w:pPr>
@@ -12971,7 +12992,7 @@
                 <w:color w:val="222222"/>
                 <w:sz w:val="19"/>
               </w:rPr>
-              <w:t>Cleric</w:t>
+              <w:t>Briar Knight</w:t>
             </w:r>
           </w:p>
         </w:tc>
@@ -13007,13 +13028,31 @@
                 <w:color w:val="222222"/>
                 <w:sz w:val="19"/>
               </w:rPr>
+              <w:t>3</w:t>
+            </w:r>
+          </w:p>
+        </w:tc>
+        <w:tc>
+          <w:tcPr>
+            <w:tcW w:type="dxa" w:w="578"/>
+          </w:tcPr>
+          <w:p>
+            <w:pPr>
+              <w:spacing w:before="0" w:after="0" w:lineRule="auto" w:line="252"/>
+            </w:pPr>
+            <w:r>
+              <w:rPr>
+                <w:rFonts w:ascii="Calibri" w:hAnsi="Calibri" w:cs="Calibri" w:eastAsia="Calibri"/>
+                <w:color w:val="222222"/>
+                <w:sz w:val="19"/>
+              </w:rPr>
               <w:t>0</w:t>
             </w:r>
           </w:p>
         </w:tc>
         <w:tc>
           <w:tcPr>
-            <w:tcW w:type="dxa" w:w="578"/>
+            <w:tcW w:type="dxa" w:w="471"/>
           </w:tcPr>
           <w:p>
             <w:pPr>
@@ -13025,13 +13064,31 @@
                 <w:color w:val="222222"/>
                 <w:sz w:val="19"/>
               </w:rPr>
+              <w:t>9</w:t>
+            </w:r>
+          </w:p>
+        </w:tc>
+        <w:tc>
+          <w:tcPr>
+            <w:tcW w:type="dxa" w:w="901"/>
+          </w:tcPr>
+          <w:p>
+            <w:pPr>
+              <w:spacing w:before="0" w:after="0" w:lineRule="auto" w:line="252"/>
+            </w:pPr>
+            <w:r>
+              <w:rPr>
+                <w:rFonts w:ascii="Calibri" w:hAnsi="Calibri" w:cs="Calibri" w:eastAsia="Calibri"/>
+                <w:color w:val="222222"/>
+                <w:sz w:val="19"/>
+              </w:rPr>
               <w:t>3</w:t>
             </w:r>
           </w:p>
         </w:tc>
         <w:tc>
           <w:tcPr>
-            <w:tcW w:type="dxa" w:w="471"/>
+            <w:tcW w:type="dxa" w:w="686"/>
           </w:tcPr>
           <w:p>
             <w:pPr>
@@ -13043,13 +13100,13 @@
                 <w:color w:val="222222"/>
                 <w:sz w:val="19"/>
               </w:rPr>
-              <w:t>12</w:t>
-            </w:r>
-          </w:p>
-        </w:tc>
-        <w:tc>
-          <w:tcPr>
-            <w:tcW w:type="dxa" w:w="901"/>
+              <w:t>5</w:t>
+            </w:r>
+          </w:p>
+        </w:tc>
+        <w:tc>
+          <w:tcPr>
+            <w:tcW w:type="dxa" w:w="4082"/>
           </w:tcPr>
           <w:p>
             <w:pPr>
@@ -13061,43 +13118,7 @@
                 <w:color w:val="222222"/>
                 <w:sz w:val="19"/>
               </w:rPr>
-              <w:t>3</w:t>
-            </w:r>
-          </w:p>
-        </w:tc>
-        <w:tc>
-          <w:tcPr>
-            <w:tcW w:type="dxa" w:w="686"/>
-          </w:tcPr>
-          <w:p>
-            <w:pPr>
-              <w:spacing w:before="0" w:after="0" w:lineRule="auto" w:line="252"/>
-            </w:pPr>
-            <w:r>
-              <w:rPr>
-                <w:rFonts w:ascii="Calibri" w:hAnsi="Calibri" w:cs="Calibri" w:eastAsia="Calibri"/>
-                <w:color w:val="222222"/>
-                <w:sz w:val="19"/>
-              </w:rPr>
-              <w:t>5</w:t>
-            </w:r>
-          </w:p>
-        </w:tc>
-        <w:tc>
-          <w:tcPr>
-            <w:tcW w:type="dxa" w:w="4620"/>
-          </w:tcPr>
-          <w:p>
-            <w:pPr>
-              <w:spacing w:before="0" w:after="0" w:lineRule="auto" w:line="252"/>
-            </w:pPr>
-            <w:r>
-              <w:rPr>
-                <w:rFonts w:ascii="Calibri" w:hAnsi="Calibri" w:cs="Calibri" w:eastAsia="Calibri"/>
-                <w:color w:val="222222"/>
-                <w:sz w:val="19"/>
-              </w:rPr>
-              <w:t>Two good stats, can draw extra cards</w:t>
+              <w:t>Duelist: two good stats, can draw extra cards</w:t>
             </w:r>
           </w:p>
         </w:tc>
@@ -13108,7 +13129,7 @@
         </w:trPr>
         <w:tc>
           <w:tcPr>
-            <w:tcW w:type="dxa" w:w="1225"/>
+            <w:tcW w:type="dxa" w:w="1763"/>
           </w:tcPr>
           <w:p>
             <w:pPr>
@@ -13120,7 +13141,7 @@
                 <w:color w:val="222222"/>
                 <w:sz w:val="19"/>
               </w:rPr>
-              <w:t>Ranger</w:t>
+              <w:t>Hollow Pilgrim</w:t>
             </w:r>
           </w:p>
         </w:tc>
@@ -13234,7 +13255,7 @@
         </w:tc>
         <w:tc>
           <w:tcPr>
-            <w:tcW w:type="dxa" w:w="4620"/>
+            <w:tcW w:type="dxa" w:w="4082"/>
           </w:tcPr>
           <w:p>
             <w:pPr>
@@ -13246,7 +13267,7 @@
                 <w:color w:val="222222"/>
                 <w:sz w:val="19"/>
               </w:rPr>
-              <w:t>Spread-out stats, bigger hand, moves far</w:t>
+              <w:t>Wanderer: spread-out stats, bigger hand, moves far</w:t>
             </w:r>
           </w:p>
         </w:tc>
@@ -13344,10 +13365,10 @@
         </w:tblCellMar>
       </w:tblPr>
       <w:tblGrid>
-        <w:gridCol w:w="1225"/>
-        <w:gridCol w:w="2775"/>
-        <w:gridCol w:w="2782"/>
-        <w:gridCol w:w="2856"/>
+        <w:gridCol w:w="1763"/>
+        <w:gridCol w:w="2625"/>
+        <w:gridCol w:w="2625"/>
+        <w:gridCol w:w="2625"/>
       </w:tblGrid>
       <w:tr>
         <w:trPr>
@@ -13356,7 +13377,7 @@
         </w:trPr>
         <w:tc>
           <w:tcPr>
-            <w:tcW w:type="dxa" w:w="1225"/>
+            <w:tcW w:type="dxa" w:w="1763"/>
             <w:shd w:val="clear" w:color="auto" w:fill="EDEDED"/>
           </w:tcPr>
           <w:p>
@@ -13376,7 +13397,7 @@
         </w:tc>
         <w:tc>
           <w:tcPr>
-            <w:tcW w:type="dxa" w:w="2775"/>
+            <w:tcW w:type="dxa" w:w="2625"/>
             <w:shd w:val="clear" w:color="auto" w:fill="EDEDED"/>
           </w:tcPr>
           <w:p>
@@ -13396,7 +13417,7 @@
         </w:tc>
         <w:tc>
           <w:tcPr>
-            <w:tcW w:type="dxa" w:w="2782"/>
+            <w:tcW w:type="dxa" w:w="2625"/>
             <w:shd w:val="clear" w:color="auto" w:fill="EDEDED"/>
           </w:tcPr>
           <w:p>
@@ -13416,7 +13437,7 @@
         </w:tc>
         <w:tc>
           <w:tcPr>
-            <w:tcW w:type="dxa" w:w="2856"/>
+            <w:tcW w:type="dxa" w:w="2625"/>
             <w:shd w:val="clear" w:color="auto" w:fill="EDEDED"/>
           </w:tcPr>
           <w:p>
@@ -13441,7 +13462,7 @@
         </w:trPr>
         <w:tc>
           <w:tcPr>
-            <w:tcW w:type="dxa" w:w="1225"/>
+            <w:tcW w:type="dxa" w:w="1763"/>
           </w:tcPr>
           <w:p>
             <w:pPr>
@@ -13453,13 +13474,13 @@
                 <w:color w:val="222222"/>
                 <w:sz w:val="20"/>
               </w:rPr>
-              <w:t>Knight</w:t>
-            </w:r>
-          </w:p>
-        </w:tc>
-        <w:tc>
-          <w:tcPr>
-            <w:tcW w:type="dxa" w:w="2775"/>
+              <w:t>Bellkeeper</w:t>
+            </w:r>
+          </w:p>
+        </w:tc>
+        <w:tc>
+          <w:tcPr>
+            <w:tcW w:type="dxa" w:w="2625"/>
           </w:tcPr>
           <w:p>
             <w:pPr>
@@ -13472,7 +13493,7 @@
                 <w:color w:val="222222"/>
                 <w:sz w:val="20"/>
               </w:rPr>
-              <w:t>Cleave:</w:t>
+              <w:t>Iron Toll:</w:t>
             </w:r>
             <w:r>
               <w:rPr>
@@ -13486,7 +13507,7 @@
         </w:tc>
         <w:tc>
           <w:tcPr>
-            <w:tcW w:type="dxa" w:w="2782"/>
+            <w:tcW w:type="dxa" w:w="2625"/>
           </w:tcPr>
           <w:p>
             <w:pPr>
@@ -13499,7 +13520,7 @@
                 <w:color w:val="222222"/>
                 <w:sz w:val="20"/>
               </w:rPr>
-              <w:t>Provoke:</w:t>
+              <w:t>Stand Fast:</w:t>
             </w:r>
             <w:r>
               <w:rPr>
@@ -13513,7 +13534,7 @@
         </w:tc>
         <w:tc>
           <w:tcPr>
-            <w:tcW w:type="dxa" w:w="2856"/>
+            <w:tcW w:type="dxa" w:w="2625"/>
           </w:tcPr>
           <w:p>
             <w:pPr>
@@ -13526,7 +13547,7 @@
                 <w:color w:val="222222"/>
                 <w:sz w:val="20"/>
               </w:rPr>
-              <w:t>Shield Wall</w:t>
+              <w:t>Echo Guard</w:t>
             </w:r>
             <w:r>
               <w:rPr>
@@ -13545,7 +13566,7 @@
         </w:trPr>
         <w:tc>
           <w:tcPr>
-            <w:tcW w:type="dxa" w:w="1225"/>
+            <w:tcW w:type="dxa" w:w="1763"/>
           </w:tcPr>
           <w:p>
             <w:pPr>
@@ -13557,13 +13578,13 @@
                 <w:color w:val="222222"/>
                 <w:sz w:val="20"/>
               </w:rPr>
-              <w:t>Rogue</w:t>
-            </w:r>
-          </w:p>
-        </w:tc>
-        <w:tc>
-          <w:tcPr>
-            <w:tcW w:type="dxa" w:w="2775"/>
+              <w:t>Foxglove</w:t>
+            </w:r>
+          </w:p>
+        </w:tc>
+        <w:tc>
+          <w:tcPr>
+            <w:tcW w:type="dxa" w:w="2625"/>
           </w:tcPr>
           <w:p>
             <w:pPr>
@@ -13576,7 +13597,7 @@
                 <w:color w:val="222222"/>
                 <w:sz w:val="20"/>
               </w:rPr>
-              <w:t>Backstab:</w:t>
+              <w:t>Quickstep:</w:t>
             </w:r>
             <w:r>
               <w:rPr>
@@ -13590,7 +13611,7 @@
         </w:tc>
         <w:tc>
           <w:tcPr>
-            <w:tcW w:type="dxa" w:w="2782"/>
+            <w:tcW w:type="dxa" w:w="2625"/>
           </w:tcPr>
           <w:p>
             <w:pPr>
@@ -13603,7 +13624,7 @@
                 <w:color w:val="222222"/>
                 <w:sz w:val="20"/>
               </w:rPr>
-              <w:t>Trip:</w:t>
+              <w:t>Pocket Sand:</w:t>
             </w:r>
             <w:r>
               <w:rPr>
@@ -13617,7 +13638,7 @@
         </w:tc>
         <w:tc>
           <w:tcPr>
-            <w:tcW w:type="dxa" w:w="2856"/>
+            <w:tcW w:type="dxa" w:w="2625"/>
           </w:tcPr>
           <w:p>
             <w:pPr>
@@ -13630,7 +13651,7 @@
                 <w:color w:val="222222"/>
                 <w:sz w:val="20"/>
               </w:rPr>
-              <w:t>Pickpocket</w:t>
+              <w:t>False Image</w:t>
             </w:r>
             <w:r>
               <w:rPr>
@@ -13649,7 +13670,7 @@
         </w:trPr>
         <w:tc>
           <w:tcPr>
-            <w:tcW w:type="dxa" w:w="1225"/>
+            <w:tcW w:type="dxa" w:w="1763"/>
           </w:tcPr>
           <w:p>
             <w:pPr>
@@ -13661,13 +13682,13 @@
                 <w:color w:val="222222"/>
                 <w:sz w:val="20"/>
               </w:rPr>
-              <w:t>Mage</w:t>
-            </w:r>
-          </w:p>
-        </w:tc>
-        <w:tc>
-          <w:tcPr>
-            <w:tcW w:type="dxa" w:w="2775"/>
+              <w:t>Ash Scribe</w:t>
+            </w:r>
+          </w:p>
+        </w:tc>
+        <w:tc>
+          <w:tcPr>
+            <w:tcW w:type="dxa" w:w="2625"/>
           </w:tcPr>
           <w:p>
             <w:pPr>
@@ -13680,7 +13701,7 @@
                 <w:color w:val="222222"/>
                 <w:sz w:val="20"/>
               </w:rPr>
-              <w:t>Fireball:</w:t>
+              <w:t>Mark of Knowing:</w:t>
             </w:r>
             <w:r>
               <w:rPr>
@@ -13694,7 +13715,7 @@
         </w:tc>
         <w:tc>
           <w:tcPr>
-            <w:tcW w:type="dxa" w:w="2782"/>
+            <w:tcW w:type="dxa" w:w="2625"/>
           </w:tcPr>
           <w:p>
             <w:pPr>
@@ -13707,7 +13728,7 @@
                 <w:color w:val="222222"/>
                 <w:sz w:val="20"/>
               </w:rPr>
-              <w:t>Hex:</w:t>
+              <w:t>Ink Snare:</w:t>
             </w:r>
             <w:r>
               <w:rPr>
@@ -13721,7 +13742,7 @@
         </w:tc>
         <w:tc>
           <w:tcPr>
-            <w:tcW w:type="dxa" w:w="2856"/>
+            <w:tcW w:type="dxa" w:w="2625"/>
           </w:tcPr>
           <w:p>
             <w:pPr>
@@ -13734,7 +13755,7 @@
                 <w:color w:val="222222"/>
                 <w:sz w:val="20"/>
               </w:rPr>
-              <w:t>Arcane Surge</w:t>
+              <w:t>Recollection</w:t>
             </w:r>
             <w:r>
               <w:rPr>
@@ -13753,7 +13774,7 @@
         </w:trPr>
         <w:tc>
           <w:tcPr>
-            <w:tcW w:type="dxa" w:w="1225"/>
+            <w:tcW w:type="dxa" w:w="1763"/>
           </w:tcPr>
           <w:p>
             <w:pPr>
@@ -13765,13 +13786,13 @@
                 <w:color w:val="222222"/>
                 <w:sz w:val="20"/>
               </w:rPr>
-              <w:t>Cleric</w:t>
-            </w:r>
-          </w:p>
-        </w:tc>
-        <w:tc>
-          <w:tcPr>
-            <w:tcW w:type="dxa" w:w="2775"/>
+              <w:t>Briar Knight</w:t>
+            </w:r>
+          </w:p>
+        </w:tc>
+        <w:tc>
+          <w:tcPr>
+            <w:tcW w:type="dxa" w:w="2625"/>
           </w:tcPr>
           <w:p>
             <w:pPr>
@@ -13784,7 +13805,7 @@
                 <w:color w:val="222222"/>
                 <w:sz w:val="20"/>
               </w:rPr>
-              <w:t>Holy Light:</w:t>
+              <w:t>Thorn Lunge:</w:t>
             </w:r>
             <w:r>
               <w:rPr>
@@ -13798,7 +13819,7 @@
         </w:tc>
         <w:tc>
           <w:tcPr>
-            <w:tcW w:type="dxa" w:w="2782"/>
+            <w:tcW w:type="dxa" w:w="2625"/>
           </w:tcPr>
           <w:p>
             <w:pPr>
@@ -13811,7 +13832,7 @@
                 <w:color w:val="222222"/>
                 <w:sz w:val="20"/>
               </w:rPr>
-              <w:t>Penance:</w:t>
+              <w:t>Briar Mark:</w:t>
             </w:r>
             <w:r>
               <w:rPr>
@@ -13825,7 +13846,7 @@
         </w:tc>
         <w:tc>
           <w:tcPr>
-            <w:tcW w:type="dxa" w:w="2856"/>
+            <w:tcW w:type="dxa" w:w="2625"/>
           </w:tcPr>
           <w:p>
             <w:pPr>
@@ -13838,7 +13859,7 @@
                 <w:color w:val="222222"/>
                 <w:sz w:val="20"/>
               </w:rPr>
-              <w:t>Prayer</w:t>
+              <w:t>Riposte</w:t>
             </w:r>
             <w:r>
               <w:rPr>
@@ -13857,7 +13878,7 @@
         </w:trPr>
         <w:tc>
           <w:tcPr>
-            <w:tcW w:type="dxa" w:w="1225"/>
+            <w:tcW w:type="dxa" w:w="1763"/>
           </w:tcPr>
           <w:p>
             <w:pPr>
@@ -13869,13 +13890,13 @@
                 <w:color w:val="222222"/>
                 <w:sz w:val="20"/>
               </w:rPr>
-              <w:t>Ranger</w:t>
-            </w:r>
-          </w:p>
-        </w:tc>
-        <w:tc>
-          <w:tcPr>
-            <w:tcW w:type="dxa" w:w="2775"/>
+              <w:t>Hollow Pilgrim</w:t>
+            </w:r>
+          </w:p>
+        </w:tc>
+        <w:tc>
+          <w:tcPr>
+            <w:tcW w:type="dxa" w:w="2625"/>
           </w:tcPr>
           <w:p>
             <w:pPr>
@@ -13888,7 +13909,7 @@
                 <w:color w:val="222222"/>
                 <w:sz w:val="20"/>
               </w:rPr>
-              <w:t>Volley:</w:t>
+              <w:t>Wandering Step:</w:t>
             </w:r>
             <w:r>
               <w:rPr>
@@ -13902,7 +13923,7 @@
         </w:tc>
         <w:tc>
           <w:tcPr>
-            <w:tcW w:type="dxa" w:w="2782"/>
+            <w:tcW w:type="dxa" w:w="2625"/>
           </w:tcPr>
           <w:p>
             <w:pPr>
@@ -13915,7 +13936,7 @@
                 <w:color w:val="222222"/>
                 <w:sz w:val="20"/>
               </w:rPr>
-              <w:t>Snare:</w:t>
+              <w:t>Lantern Veil:</w:t>
             </w:r>
             <w:r>
               <w:rPr>
@@ -13929,7 +13950,7 @@
         </w:tc>
         <w:tc>
           <w:tcPr>
-            <w:tcW w:type="dxa" w:w="2856"/>
+            <w:tcW w:type="dxa" w:w="2625"/>
           </w:tcPr>
           <w:p>
             <w:pPr>
@@ -13942,7 +13963,7 @@
                 <w:color w:val="222222"/>
                 <w:sz w:val="20"/>
               </w:rPr>
-              <w:t>Pathfinder</w:t>
+              <w:t>Wayfinder</w:t>
             </w:r>
             <w:r>
               <w:rPr>
@@ -14572,7 +14593,7 @@
           <w:color w:val="222222"/>
           <w:sz w:val="21"/>
         </w:rPr>
-        <w:t>Ann (Mage) rolls 4 at the north Camp. There is a Merchant in the middle ring within reach, but Ann has 3 gold and would rather fight. Ann steps onto the Wilds I tile next to the Camp and draws a Bandit (HP 7, ATK 3). Spark deals 2 + 3 WIS = 5 and Quick Stab deals 1 + 1 AGI = 2. That is 7 damage, and the Bandit falls in round 1. Ann gains 1 level and 2 gold and has 3 cards left.</w:t>
+        <w:t>Ann (Ash Scribe) rolls 4 at the north Camp. There is a Merchant in the middle ring within reach, but Ann has 3 gold and would rather fight. Ann steps onto the Wilds I tile next to the Camp and draws a Bandit (HP 7, ATK 3). Spark deals 2 + 3 WIS = 5 and Quick Stab deals 1 + 1 AGI = 2. That is 7 damage, and the Bandit falls in round 1. Ann gains 1 level and 2 gold and has 3 cards left.</w:t>
       </w:r>
     </w:p>
     <w:p>
@@ -14586,7 +14607,7 @@
           <w:color w:val="222222"/>
           <w:sz w:val="21"/>
         </w:rPr>
-        <w:t>Ben (Rogue) rolls 2 at the east Camp, moves one tile out into the middle ring and lands on a Wilds II tile: a Harpy (HP 11, ATK 5). Ambush deals 4 + 3 AGI + 3 for round 1 = 10, and Quick Stab deals 1 + 3 = 4. That is 14 damage for 2 of Ben's 4 energy, and the Harpy falls. Ben is level 3 after one turn.</w:t>
+        <w:t>Ben (Foxglove) rolls 2 at the east Camp, moves one tile out into the middle ring and lands on a Wilds II tile: a Harpy (HP 11, ATK 5). Ambush deals 4 + 3 AGI + 3 for round 1 = 10, and Quick Stab deals 1 + 3 = 4. That is 14 damage for 2 of Ben's 4 energy, and the Harpy falls. Ben is level 3 after one turn.</w:t>
       </w:r>
     </w:p>
     <w:p>
@@ -14600,7 +14621,7 @@
           <w:color w:val="222222"/>
           <w:sz w:val="21"/>
         </w:rPr>
-        <w:t>Cleo (Cleric) holds three AGI cards (AGI 0) and RESTs: Cleo discards them and draws 3 new cards.</w:t>
+        <w:t>Cleo (Briar Knight) holds three WIS cards (WIS 0) and RESTs: Cleo discards them and draws 3 new cards.</w:t>
       </w:r>
     </w:p>
     <w:p>
@@ -14614,7 +14635,7 @@
           <w:color w:val="222222"/>
           <w:sz w:val="21"/>
         </w:rPr>
-        <w:t>Dan (Knight) rolls 5 and stops on a Wilds I tile: Lost Purse, +2 gold. Dan now has 5 gold, enough to raise STR from 3 to 4 at a Barracks next turn.</w:t>
+        <w:t>Dan (Bellkeeper) rolls 5 and stops on a Wilds I tile: Lost Purse, +2 gold. Dan now has 5 gold, enough to raise STR from 3 to 4 at a Barracks next turn.</w:t>
       </w:r>
     </w:p>
     <w:p>

</xml_diff>